<commit_message>
Add generated results to repository
</commit_message>
<xml_diff>
--- a/results/QHM6706-Supervision_log_template.docx
+++ b/results/QHM6706-Supervision_log_template.docx
@@ -368,12 +368,14 @@
                 <w:rFonts w:ascii="Times New Roman" w:hAnsi="Times New Roman" w:cs="Times New Roman"/>
               </w:rPr>
             </w:pPr>
+            <w:proofErr w:type="spellStart"/>
             <w:r>
               <w:rPr>
                 <w:rFonts w:ascii="Times New Roman" w:hAnsi="Times New Roman" w:cs="Times New Roman" w:hint="eastAsia"/>
               </w:rPr>
               <w:t>Mingqi</w:t>
             </w:r>
+            <w:proofErr w:type="spellEnd"/>
           </w:p>
         </w:tc>
       </w:tr>
@@ -644,6 +646,19 @@
                 <w:rFonts w:ascii="Times New Roman" w:hAnsi="Times New Roman" w:cs="Times New Roman"/>
               </w:rPr>
             </w:pPr>
+            <w:r>
+              <w:rPr>
+                <w:rFonts w:ascii="Times New Roman" w:hAnsi="Times New Roman" w:cs="Times New Roman"/>
+              </w:rPr>
+              <w:t>Network Analysis of the Chinese High-Speed Railway System</w:t>
+            </w:r>
+          </w:p>
+          <w:p>
+            <w:pPr>
+              <w:rPr>
+                <w:rFonts w:ascii="Times New Roman" w:hAnsi="Times New Roman" w:cs="Times New Roman"/>
+              </w:rPr>
+            </w:pPr>
           </w:p>
         </w:tc>
       </w:tr>
@@ -751,37 +766,6 @@
                 <w:rFonts w:ascii="Times New Roman" w:hAnsi="Times New Roman" w:cs="Times New Roman"/>
               </w:rPr>
             </w:pPr>
-            <w:r>
-              <w:rPr>
-                <w:rFonts w:ascii="Times New Roman" w:hAnsi="Times New Roman" w:cs="Times New Roman"/>
-              </w:rPr>
-              <w:t>[These are examples, please DELETE</w:t>
-            </w:r>
-            <w:r>
-              <w:rPr>
-                <w:rFonts w:ascii="Times New Roman" w:hAnsi="Times New Roman" w:cs="Times New Roman"/>
-              </w:rPr>
-              <w:t xml:space="preserve"> them</w:t>
-            </w:r>
-            <w:r>
-              <w:rPr>
-                <w:rFonts w:ascii="Times New Roman" w:hAnsi="Times New Roman" w:cs="Times New Roman"/>
-              </w:rPr>
-              <w:t xml:space="preserve"> and add yours. DELETE this line.</w:t>
-            </w:r>
-            <w:r>
-              <w:rPr>
-                <w:rFonts w:ascii="Times New Roman" w:hAnsi="Times New Roman" w:cs="Times New Roman"/>
-              </w:rPr>
-              <w:t>]</w:t>
-            </w:r>
-          </w:p>
-          <w:p>
-            <w:pPr>
-              <w:rPr>
-                <w:rFonts w:ascii="Times New Roman" w:hAnsi="Times New Roman" w:cs="Times New Roman"/>
-              </w:rPr>
-            </w:pPr>
           </w:p>
           <w:p>
             <w:pPr>
@@ -965,6 +949,8 @@
                 <w:color w:val="000000"/>
               </w:rPr>
             </w:pPr>
+            <w:proofErr w:type="spellStart"/>
+            <w:proofErr w:type="gramStart"/>
             <w:r>
               <w:rPr>
                 <w:rFonts w:ascii="Times New Roman" w:hAnsi="Times New Roman" w:cs="Times New Roman"/>
@@ -975,7 +961,15 @@
               <w:rPr>
                 <w:rFonts w:ascii="Times New Roman" w:hAnsi="Times New Roman" w:cs="Times New Roman" w:hint="eastAsia"/>
               </w:rPr>
-              <w:t xml:space="preserve">discus about the </w:t>
+              <w:t>discus</w:t>
+            </w:r>
+            <w:proofErr w:type="spellEnd"/>
+            <w:proofErr w:type="gramEnd"/>
+            <w:r>
+              <w:rPr>
+                <w:rFonts w:ascii="Times New Roman" w:hAnsi="Times New Roman" w:cs="Times New Roman" w:hint="eastAsia"/>
+              </w:rPr>
+              <w:t xml:space="preserve"> about the </w:t>
             </w:r>
             <w:r>
               <w:rPr>
@@ -1005,6 +999,7 @@
               </w:rPr>
               <w:t xml:space="preserve"> </w:t>
             </w:r>
+            <w:proofErr w:type="spellStart"/>
             <w:r>
               <w:rPr>
                 <w:rFonts w:ascii="Times New Roman" w:hAnsi="Times New Roman" w:cs="Times New Roman"/>
@@ -1012,6 +1007,7 @@
               </w:rPr>
               <w:t>Specification_Report_Student_Template</w:t>
             </w:r>
+            <w:proofErr w:type="spellEnd"/>
             <w:r>
               <w:rPr>
                 <w:rFonts w:ascii="Times New Roman" w:hAnsi="Times New Roman" w:cs="Times New Roman" w:hint="eastAsia"/>
@@ -1107,6 +1103,7 @@
               </w:rPr>
               <w:t xml:space="preserve"> finish the final </w:t>
             </w:r>
+            <w:proofErr w:type="spellStart"/>
             <w:r>
               <w:rPr>
                 <w:rFonts w:ascii="Times New Roman" w:hAnsi="Times New Roman" w:cs="Times New Roman"/>
@@ -1114,6 +1111,7 @@
               </w:rPr>
               <w:t>Specification_Report_Student_Template</w:t>
             </w:r>
+            <w:proofErr w:type="spellEnd"/>
           </w:p>
           <w:p>
             <w:pPr>
@@ -1175,7 +1173,7 @@
           <w:p>
             <w:pPr>
               <w:rPr>
-                <w:rFonts w:ascii="Times New Roman" w:hAnsi="Times New Roman" w:cs="Times New Roman"/>
+                <w:rFonts w:ascii="Times New Roman" w:hAnsi="Times New Roman" w:cs="Times New Roman" w:hint="eastAsia"/>
               </w:rPr>
             </w:pPr>
             <w:r>
@@ -1194,7 +1192,13 @@
               <w:rPr>
                 <w:rFonts w:ascii="Times New Roman" w:hAnsi="Times New Roman" w:cs="Times New Roman"/>
               </w:rPr>
-              <w:t>Discussed the Early_Term-Progress_Seport_Template about the project</w:t>
+              <w:t xml:space="preserve">Discussed the </w:t>
+            </w:r>
+            <w:r>
+              <w:rPr>
+                <w:rFonts w:ascii="Times New Roman" w:hAnsi="Times New Roman" w:cs="Times New Roman" w:hint="eastAsia"/>
+              </w:rPr>
+              <w:t>work plan about the next month</w:t>
             </w:r>
           </w:p>
           <w:p>
@@ -1227,7 +1231,7 @@
               <w:rPr>
                 <w:rFonts w:ascii="Times New Roman" w:hAnsi="Times New Roman" w:cs="Times New Roman" w:hint="eastAsia"/>
               </w:rPr>
-              <w:t>10</w:t>
+              <w:t>27</w:t>
             </w:r>
             <w:r>
               <w:rPr>
@@ -1279,6 +1283,52 @@
               </w:rPr>
               <w:t>：</w:t>
             </w:r>
+            <w:r>
+              <w:rPr>
+                <w:rFonts w:ascii="Times New Roman" w:hAnsi="Times New Roman" w:cs="Times New Roman"/>
+              </w:rPr>
+              <w:t xml:space="preserve">Discussed the </w:t>
+            </w:r>
+            <w:proofErr w:type="spellStart"/>
+            <w:r>
+              <w:rPr>
+                <w:rFonts w:ascii="Times New Roman" w:hAnsi="Times New Roman" w:cs="Times New Roman"/>
+              </w:rPr>
+              <w:t>Early_Term-Progress_</w:t>
+            </w:r>
+            <w:r>
+              <w:rPr>
+                <w:rFonts w:ascii="Times New Roman" w:hAnsi="Times New Roman" w:cs="Times New Roman" w:hint="eastAsia"/>
+              </w:rPr>
+              <w:t>r</w:t>
+            </w:r>
+            <w:r>
+              <w:rPr>
+                <w:rFonts w:ascii="Times New Roman" w:hAnsi="Times New Roman" w:cs="Times New Roman"/>
+              </w:rPr>
+              <w:t>eport_Template</w:t>
+            </w:r>
+            <w:proofErr w:type="spellEnd"/>
+            <w:r>
+              <w:rPr>
+                <w:rFonts w:ascii="Times New Roman" w:hAnsi="Times New Roman" w:cs="Times New Roman"/>
+              </w:rPr>
+              <w:t xml:space="preserve"> about the project</w:t>
+            </w:r>
+          </w:p>
+          <w:p>
+            <w:pPr>
+              <w:rPr>
+                <w:rFonts w:ascii="Times New Roman" w:hAnsi="Times New Roman" w:cs="Times New Roman"/>
+              </w:rPr>
+            </w:pPr>
+          </w:p>
+          <w:p>
+            <w:pPr>
+              <w:rPr>
+                <w:rFonts w:ascii="Times New Roman" w:hAnsi="Times New Roman" w:cs="Times New Roman"/>
+              </w:rPr>
+            </w:pPr>
           </w:p>
           <w:p>
             <w:pPr>
@@ -1303,7 +1353,7 @@
               <w:rPr>
                 <w:rFonts w:ascii="Times New Roman" w:hAnsi="Times New Roman" w:cs="Times New Roman" w:hint="eastAsia"/>
               </w:rPr>
-              <w:t>27</w:t>
+              <w:t>14</w:t>
             </w:r>
             <w:r>
               <w:rPr>
@@ -1315,56 +1365,674 @@
               <w:rPr>
                 <w:rFonts w:ascii="Times New Roman" w:hAnsi="Times New Roman" w:cs="Times New Roman" w:hint="eastAsia"/>
               </w:rPr>
+              <w:t>-</w:t>
+            </w:r>
+            <w:r>
+              <w:rPr>
+                <w:rFonts w:ascii="Times New Roman" w:hAnsi="Times New Roman" w:cs="Times New Roman"/>
+              </w:rPr>
+              <w:t>202</w:t>
+            </w:r>
+            <w:r>
+              <w:rPr>
+                <w:rFonts w:ascii="Times New Roman" w:hAnsi="Times New Roman" w:cs="Times New Roman" w:hint="eastAsia"/>
+              </w:rPr>
+              <w:t>6</w:t>
+            </w:r>
+          </w:p>
+          <w:p>
+            <w:pPr>
+              <w:rPr>
+                <w:rFonts w:ascii="Times New Roman" w:hAnsi="Times New Roman" w:cs="Times New Roman"/>
+              </w:rPr>
+            </w:pPr>
+            <w:r>
+              <w:rPr>
+                <w:rFonts w:ascii="Times New Roman" w:hAnsi="Times New Roman" w:cs="Times New Roman"/>
+              </w:rPr>
+              <w:t>Supervision type: online meeting</w:t>
+            </w:r>
+          </w:p>
+          <w:p>
+            <w:pPr>
+              <w:rPr>
+                <w:rFonts w:ascii="Times New Roman" w:hAnsi="Times New Roman" w:cs="Times New Roman"/>
+              </w:rPr>
+            </w:pPr>
+            <w:r>
+              <w:rPr>
+                <w:rFonts w:ascii="Times New Roman" w:hAnsi="Times New Roman" w:cs="Times New Roman"/>
+              </w:rPr>
+              <w:t>Summary</w:t>
+            </w:r>
+            <w:r>
+              <w:rPr>
+                <w:rFonts w:ascii="Times New Roman" w:hAnsi="Times New Roman" w:cs="Times New Roman" w:hint="eastAsia"/>
+              </w:rPr>
+              <w:t>：</w:t>
+            </w:r>
+            <w:r>
+              <w:rPr>
+                <w:rFonts w:ascii="Times New Roman" w:hAnsi="Times New Roman" w:cs="Times New Roman"/>
+              </w:rPr>
+              <w:t>Confirm the next task, define a method to quantify the time evolution, robustness, and socio-economic connections of the railway system, and consider the population weighted impact of faults</w:t>
+            </w:r>
+          </w:p>
+          <w:p>
+            <w:pPr>
+              <w:rPr>
+                <w:rFonts w:ascii="Times New Roman" w:hAnsi="Times New Roman" w:cs="Times New Roman"/>
+              </w:rPr>
+            </w:pPr>
+          </w:p>
+          <w:p>
+            <w:pPr>
+              <w:rPr>
+                <w:rFonts w:ascii="Times New Roman" w:hAnsi="Times New Roman" w:cs="Times New Roman"/>
+              </w:rPr>
+            </w:pPr>
+          </w:p>
+          <w:p>
+            <w:pPr>
+              <w:rPr>
+                <w:rFonts w:ascii="Times New Roman" w:hAnsi="Times New Roman" w:cs="Times New Roman" w:hint="eastAsia"/>
+              </w:rPr>
+            </w:pPr>
+          </w:p>
+          <w:p>
+            <w:pPr>
+              <w:rPr>
+                <w:rFonts w:ascii="Times New Roman" w:hAnsi="Times New Roman" w:cs="Times New Roman"/>
+              </w:rPr>
+            </w:pPr>
+            <w:r>
+              <w:rPr>
+                <w:rFonts w:ascii="Times New Roman" w:hAnsi="Times New Roman" w:cs="Times New Roman"/>
+              </w:rPr>
+              <w:t>Date:</w:t>
+            </w:r>
+            <w:r>
+              <w:rPr>
+                <w:rFonts w:ascii="Times New Roman" w:hAnsi="Times New Roman" w:cs="Times New Roman" w:hint="eastAsia"/>
+              </w:rPr>
+              <w:t>28</w:t>
+            </w:r>
+            <w:r>
+              <w:rPr>
+                <w:rFonts w:ascii="Times New Roman" w:hAnsi="Times New Roman" w:cs="Times New Roman"/>
+              </w:rPr>
+              <w:t>-1</w:t>
+            </w:r>
+            <w:r>
+              <w:rPr>
+                <w:rFonts w:ascii="Times New Roman" w:hAnsi="Times New Roman" w:cs="Times New Roman" w:hint="eastAsia"/>
+              </w:rPr>
+              <w:t>-</w:t>
+            </w:r>
+            <w:r>
+              <w:rPr>
+                <w:rFonts w:ascii="Times New Roman" w:hAnsi="Times New Roman" w:cs="Times New Roman"/>
+              </w:rPr>
+              <w:t>202</w:t>
+            </w:r>
+            <w:r>
+              <w:rPr>
+                <w:rFonts w:ascii="Times New Roman" w:hAnsi="Times New Roman" w:cs="Times New Roman" w:hint="eastAsia"/>
+              </w:rPr>
+              <w:t>6</w:t>
+            </w:r>
+          </w:p>
+          <w:p>
+            <w:pPr>
+              <w:rPr>
+                <w:rFonts w:ascii="Times New Roman" w:hAnsi="Times New Roman" w:cs="Times New Roman"/>
+              </w:rPr>
+            </w:pPr>
+            <w:r>
+              <w:rPr>
+                <w:rFonts w:ascii="Times New Roman" w:hAnsi="Times New Roman" w:cs="Times New Roman"/>
+              </w:rPr>
+              <w:t>Supervision type: online meeting</w:t>
+            </w:r>
+          </w:p>
+          <w:p>
+            <w:pPr>
+              <w:rPr>
+                <w:rFonts w:ascii="Times New Roman" w:hAnsi="Times New Roman" w:cs="Times New Roman"/>
+              </w:rPr>
+            </w:pPr>
+            <w:r>
+              <w:rPr>
+                <w:rFonts w:ascii="Times New Roman" w:hAnsi="Times New Roman" w:cs="Times New Roman"/>
+              </w:rPr>
+              <w:t>Summary</w:t>
+            </w:r>
+            <w:r>
+              <w:rPr>
+                <w:rFonts w:ascii="Times New Roman" w:hAnsi="Times New Roman" w:cs="Times New Roman" w:hint="eastAsia"/>
+              </w:rPr>
+              <w:t>：</w:t>
+            </w:r>
+            <w:r>
+              <w:rPr>
+                <w:rFonts w:ascii="Times New Roman" w:hAnsi="Times New Roman" w:cs="Times New Roman"/>
+              </w:rPr>
+              <w:t>Discussed the exploratory network analysis task of computing centrality measurement and allocation completed last week: identifying early connection types, creating two-year charts (number of stations and total/HSR railway length), drawing network and centrality maps for selected years, summarizing the main results, and using these findings to support subsequent robustness analysis</w:t>
+            </w:r>
+          </w:p>
+          <w:p>
+            <w:pPr>
+              <w:rPr>
+                <w:rFonts w:ascii="Times New Roman" w:hAnsi="Times New Roman" w:cs="Times New Roman"/>
+              </w:rPr>
+            </w:pPr>
+          </w:p>
+          <w:p>
+            <w:pPr>
+              <w:rPr>
+                <w:rFonts w:ascii="Times New Roman" w:hAnsi="Times New Roman" w:cs="Times New Roman"/>
+              </w:rPr>
+            </w:pPr>
+          </w:p>
+          <w:p>
+            <w:pPr>
+              <w:rPr>
+                <w:rFonts w:ascii="Times New Roman" w:hAnsi="Times New Roman" w:cs="Times New Roman"/>
+              </w:rPr>
+            </w:pPr>
+            <w:r>
+              <w:rPr>
+                <w:rFonts w:ascii="Times New Roman" w:hAnsi="Times New Roman" w:cs="Times New Roman"/>
+              </w:rPr>
+              <w:t>Date:</w:t>
+            </w:r>
+            <w:r>
+              <w:rPr>
+                <w:rFonts w:ascii="Times New Roman" w:hAnsi="Times New Roman" w:cs="Times New Roman" w:hint="eastAsia"/>
+              </w:rPr>
+              <w:t>1</w:t>
+            </w:r>
+            <w:r>
+              <w:rPr>
+                <w:rFonts w:ascii="Times New Roman" w:hAnsi="Times New Roman" w:cs="Times New Roman" w:hint="eastAsia"/>
+              </w:rPr>
+              <w:t>1</w:t>
+            </w:r>
+            <w:r>
+              <w:rPr>
+                <w:rFonts w:ascii="Times New Roman" w:hAnsi="Times New Roman" w:cs="Times New Roman"/>
+              </w:rPr>
+              <w:t>-</w:t>
+            </w:r>
+            <w:r>
+              <w:rPr>
+                <w:rFonts w:ascii="Times New Roman" w:hAnsi="Times New Roman" w:cs="Times New Roman" w:hint="eastAsia"/>
+              </w:rPr>
               <w:t>2</w:t>
             </w:r>
             <w:r>
               <w:rPr>
-                <w:rFonts w:ascii="Times New Roman" w:hAnsi="Times New Roman" w:cs="Times New Roman"/>
-              </w:rPr>
-              <w:t>-2025</w:t>
-            </w:r>
-          </w:p>
-          <w:p>
-            <w:pPr>
-              <w:rPr>
-                <w:rFonts w:ascii="Times New Roman" w:hAnsi="Times New Roman" w:cs="Times New Roman"/>
-              </w:rPr>
-            </w:pPr>
-          </w:p>
-          <w:p>
-            <w:pPr>
-              <w:rPr>
-                <w:rFonts w:ascii="Times New Roman" w:hAnsi="Times New Roman" w:cs="Times New Roman"/>
-              </w:rPr>
-            </w:pPr>
-          </w:p>
-          <w:p>
-            <w:pPr>
-              <w:rPr>
-                <w:rFonts w:ascii="Times New Roman" w:hAnsi="Times New Roman" w:cs="Times New Roman"/>
-              </w:rPr>
-            </w:pPr>
-          </w:p>
-          <w:p>
-            <w:pPr>
-              <w:rPr>
-                <w:rFonts w:ascii="Times New Roman" w:hAnsi="Times New Roman" w:cs="Times New Roman"/>
-              </w:rPr>
-            </w:pPr>
-          </w:p>
-          <w:p>
-            <w:pPr>
-              <w:rPr>
-                <w:rFonts w:ascii="Times New Roman" w:hAnsi="Times New Roman" w:cs="Times New Roman"/>
-              </w:rPr>
-            </w:pPr>
-          </w:p>
-          <w:p>
-            <w:pPr>
-              <w:rPr>
-                <w:rFonts w:ascii="Times New Roman" w:hAnsi="Times New Roman" w:cs="Times New Roman"/>
-              </w:rPr>
-            </w:pPr>
+                <w:rFonts w:ascii="Times New Roman" w:hAnsi="Times New Roman" w:cs="Times New Roman" w:hint="eastAsia"/>
+              </w:rPr>
+              <w:t>-</w:t>
+            </w:r>
+            <w:r>
+              <w:rPr>
+                <w:rFonts w:ascii="Times New Roman" w:hAnsi="Times New Roman" w:cs="Times New Roman"/>
+              </w:rPr>
+              <w:t>202</w:t>
+            </w:r>
+            <w:r>
+              <w:rPr>
+                <w:rFonts w:ascii="Times New Roman" w:hAnsi="Times New Roman" w:cs="Times New Roman" w:hint="eastAsia"/>
+              </w:rPr>
+              <w:t>6</w:t>
+            </w:r>
+          </w:p>
+          <w:p>
+            <w:pPr>
+              <w:rPr>
+                <w:rFonts w:ascii="Times New Roman" w:hAnsi="Times New Roman" w:cs="Times New Roman"/>
+              </w:rPr>
+            </w:pPr>
+            <w:r>
+              <w:rPr>
+                <w:rFonts w:ascii="Times New Roman" w:hAnsi="Times New Roman" w:cs="Times New Roman"/>
+              </w:rPr>
+              <w:t>Supervision type: online meeting</w:t>
+            </w:r>
+          </w:p>
+          <w:p>
+            <w:pPr>
+              <w:rPr>
+                <w:rFonts w:ascii="Times New Roman" w:hAnsi="Times New Roman" w:cs="Times New Roman"/>
+              </w:rPr>
+            </w:pPr>
+            <w:r>
+              <w:rPr>
+                <w:rFonts w:ascii="Times New Roman" w:hAnsi="Times New Roman" w:cs="Times New Roman"/>
+              </w:rPr>
+              <w:t>Summary</w:t>
+            </w:r>
+            <w:r>
+              <w:rPr>
+                <w:rFonts w:ascii="Times New Roman" w:hAnsi="Times New Roman" w:cs="Times New Roman" w:hint="eastAsia"/>
+              </w:rPr>
+              <w:t>：</w:t>
+            </w:r>
+            <w:r>
+              <w:rPr>
+                <w:rFonts w:ascii="Times New Roman" w:hAnsi="Times New Roman" w:cs="Times New Roman"/>
+              </w:rPr>
+              <w:t>confirmed the centrality calculations are correct, asked to add non-normalized node degrees to the table, requested better GitHub folder organization, advised adding a China background map and showing only active stations per year, and suggested starting the robustness methodology with population data, with the next meeting in two weeks.</w:t>
+            </w:r>
+          </w:p>
+          <w:p>
+            <w:pPr>
+              <w:rPr>
+                <w:rFonts w:ascii="Times New Roman" w:hAnsi="Times New Roman" w:cs="Times New Roman" w:hint="eastAsia"/>
+              </w:rPr>
+            </w:pPr>
+          </w:p>
+          <w:p>
+            <w:pPr>
+              <w:rPr>
+                <w:rFonts w:ascii="Times New Roman" w:hAnsi="Times New Roman" w:cs="Times New Roman"/>
+              </w:rPr>
+            </w:pPr>
+          </w:p>
+          <w:p>
+            <w:pPr>
+              <w:rPr>
+                <w:rFonts w:ascii="Times New Roman" w:hAnsi="Times New Roman" w:cs="Times New Roman"/>
+              </w:rPr>
+            </w:pPr>
+            <w:r>
+              <w:rPr>
+                <w:rFonts w:ascii="Times New Roman" w:hAnsi="Times New Roman" w:cs="Times New Roman"/>
+              </w:rPr>
+              <w:t>Date:</w:t>
+            </w:r>
+            <w:r>
+              <w:rPr>
+                <w:rFonts w:ascii="Times New Roman" w:hAnsi="Times New Roman" w:cs="Times New Roman" w:hint="eastAsia"/>
+              </w:rPr>
+              <w:t>25</w:t>
+            </w:r>
+            <w:r>
+              <w:rPr>
+                <w:rFonts w:ascii="Times New Roman" w:hAnsi="Times New Roman" w:cs="Times New Roman"/>
+              </w:rPr>
+              <w:t>-</w:t>
+            </w:r>
+            <w:r>
+              <w:rPr>
+                <w:rFonts w:ascii="Times New Roman" w:hAnsi="Times New Roman" w:cs="Times New Roman" w:hint="eastAsia"/>
+              </w:rPr>
+              <w:t>2</w:t>
+            </w:r>
+            <w:r>
+              <w:rPr>
+                <w:rFonts w:ascii="Times New Roman" w:hAnsi="Times New Roman" w:cs="Times New Roman" w:hint="eastAsia"/>
+              </w:rPr>
+              <w:t>-</w:t>
+            </w:r>
+            <w:r>
+              <w:rPr>
+                <w:rFonts w:ascii="Times New Roman" w:hAnsi="Times New Roman" w:cs="Times New Roman"/>
+              </w:rPr>
+              <w:t>202</w:t>
+            </w:r>
+            <w:r>
+              <w:rPr>
+                <w:rFonts w:ascii="Times New Roman" w:hAnsi="Times New Roman" w:cs="Times New Roman" w:hint="eastAsia"/>
+              </w:rPr>
+              <w:t>6</w:t>
+            </w:r>
+          </w:p>
+          <w:p>
+            <w:pPr>
+              <w:rPr>
+                <w:rFonts w:ascii="Times New Roman" w:hAnsi="Times New Roman" w:cs="Times New Roman"/>
+              </w:rPr>
+            </w:pPr>
+            <w:r>
+              <w:rPr>
+                <w:rFonts w:ascii="Times New Roman" w:hAnsi="Times New Roman" w:cs="Times New Roman"/>
+              </w:rPr>
+              <w:t>Supervision type: online meeting</w:t>
+            </w:r>
+          </w:p>
+          <w:p>
+            <w:pPr>
+              <w:rPr>
+                <w:rFonts w:ascii="Times New Roman" w:hAnsi="Times New Roman" w:cs="Times New Roman"/>
+              </w:rPr>
+            </w:pPr>
+            <w:r>
+              <w:rPr>
+                <w:rFonts w:ascii="Times New Roman" w:hAnsi="Times New Roman" w:cs="Times New Roman"/>
+              </w:rPr>
+              <w:t>Summary</w:t>
+            </w:r>
+            <w:r>
+              <w:rPr>
+                <w:rFonts w:ascii="Times New Roman" w:hAnsi="Times New Roman" w:cs="Times New Roman" w:hint="eastAsia"/>
+              </w:rPr>
+              <w:t>：</w:t>
+            </w:r>
+            <w:r>
+              <w:rPr>
+                <w:rFonts w:ascii="Times New Roman" w:hAnsi="Times New Roman" w:cs="Times New Roman"/>
+              </w:rPr>
+              <w:t>specified the final report structure with subsections on network construction, centrality analysis, robustness analysis, and population failure effects,</w:t>
+            </w:r>
+          </w:p>
+          <w:p>
+            <w:pPr>
+              <w:rPr>
+                <w:rFonts w:ascii="Times New Roman" w:hAnsi="Times New Roman" w:cs="Times New Roman"/>
+              </w:rPr>
+            </w:pPr>
+          </w:p>
+          <w:p>
+            <w:pPr>
+              <w:rPr>
+                <w:rFonts w:ascii="Times New Roman" w:hAnsi="Times New Roman" w:cs="Times New Roman"/>
+              </w:rPr>
+            </w:pPr>
+          </w:p>
+          <w:p>
+            <w:pPr>
+              <w:rPr>
+                <w:rFonts w:ascii="Times New Roman" w:hAnsi="Times New Roman" w:cs="Times New Roman"/>
+              </w:rPr>
+            </w:pPr>
+            <w:r>
+              <w:rPr>
+                <w:rFonts w:ascii="Times New Roman" w:hAnsi="Times New Roman" w:cs="Times New Roman"/>
+              </w:rPr>
+              <w:t>Date:</w:t>
+            </w:r>
+            <w:r>
+              <w:rPr>
+                <w:rFonts w:ascii="Times New Roman" w:hAnsi="Times New Roman" w:cs="Times New Roman" w:hint="eastAsia"/>
+              </w:rPr>
+              <w:t>6</w:t>
+            </w:r>
+            <w:r>
+              <w:rPr>
+                <w:rFonts w:ascii="Times New Roman" w:hAnsi="Times New Roman" w:cs="Times New Roman"/>
+              </w:rPr>
+              <w:t>-</w:t>
+            </w:r>
+            <w:r>
+              <w:rPr>
+                <w:rFonts w:ascii="Times New Roman" w:hAnsi="Times New Roman" w:cs="Times New Roman" w:hint="eastAsia"/>
+              </w:rPr>
+              <w:t>3</w:t>
+            </w:r>
+            <w:r>
+              <w:rPr>
+                <w:rFonts w:ascii="Times New Roman" w:hAnsi="Times New Roman" w:cs="Times New Roman" w:hint="eastAsia"/>
+              </w:rPr>
+              <w:t>-</w:t>
+            </w:r>
+            <w:r>
+              <w:rPr>
+                <w:rFonts w:ascii="Times New Roman" w:hAnsi="Times New Roman" w:cs="Times New Roman"/>
+              </w:rPr>
+              <w:t>202</w:t>
+            </w:r>
+            <w:r>
+              <w:rPr>
+                <w:rFonts w:ascii="Times New Roman" w:hAnsi="Times New Roman" w:cs="Times New Roman" w:hint="eastAsia"/>
+              </w:rPr>
+              <w:t>6</w:t>
+            </w:r>
+          </w:p>
+          <w:p>
+            <w:pPr>
+              <w:rPr>
+                <w:rFonts w:ascii="Times New Roman" w:hAnsi="Times New Roman" w:cs="Times New Roman" w:hint="eastAsia"/>
+              </w:rPr>
+            </w:pPr>
+            <w:r>
+              <w:rPr>
+                <w:rFonts w:ascii="Times New Roman" w:hAnsi="Times New Roman" w:cs="Times New Roman"/>
+              </w:rPr>
+              <w:t>Supervision type:</w:t>
+            </w:r>
+            <w:r>
+              <w:rPr>
+                <w:rFonts w:ascii="Times New Roman" w:hAnsi="Times New Roman" w:cs="Times New Roman" w:hint="eastAsia"/>
+              </w:rPr>
+              <w:t xml:space="preserve"> face to face meeting</w:t>
+            </w:r>
+          </w:p>
+          <w:p>
+            <w:pPr>
+              <w:rPr>
+                <w:rFonts w:ascii="Times New Roman" w:hAnsi="Times New Roman" w:cs="Times New Roman"/>
+              </w:rPr>
+            </w:pPr>
+            <w:r>
+              <w:rPr>
+                <w:rFonts w:ascii="Times New Roman" w:hAnsi="Times New Roman" w:cs="Times New Roman"/>
+              </w:rPr>
+              <w:t>Summary</w:t>
+            </w:r>
+            <w:r>
+              <w:rPr>
+                <w:rFonts w:ascii="Times New Roman" w:hAnsi="Times New Roman" w:cs="Times New Roman" w:hint="eastAsia"/>
+              </w:rPr>
+              <w:t>：</w:t>
+            </w:r>
+            <w:r>
+              <w:rPr>
+                <w:rFonts w:ascii="Times New Roman" w:hAnsi="Times New Roman" w:cs="Times New Roman"/>
+              </w:rPr>
+              <w:t>Discussed the oral presentation of the midterm report</w:t>
+            </w:r>
+          </w:p>
+          <w:p>
+            <w:pPr>
+              <w:rPr>
+                <w:rFonts w:ascii="Times New Roman" w:hAnsi="Times New Roman" w:cs="Times New Roman" w:hint="eastAsia"/>
+              </w:rPr>
+            </w:pPr>
+          </w:p>
+          <w:p>
+            <w:pPr>
+              <w:rPr>
+                <w:rFonts w:ascii="Times New Roman" w:hAnsi="Times New Roman" w:cs="Times New Roman"/>
+              </w:rPr>
+            </w:pPr>
+          </w:p>
+          <w:p>
+            <w:pPr>
+              <w:rPr>
+                <w:rFonts w:ascii="Times New Roman" w:hAnsi="Times New Roman" w:cs="Times New Roman"/>
+              </w:rPr>
+            </w:pPr>
+            <w:r>
+              <w:rPr>
+                <w:rFonts w:ascii="Times New Roman" w:hAnsi="Times New Roman" w:cs="Times New Roman"/>
+              </w:rPr>
+              <w:t>Date:</w:t>
+            </w:r>
+            <w:r>
+              <w:rPr>
+                <w:rFonts w:ascii="Times New Roman" w:hAnsi="Times New Roman" w:cs="Times New Roman" w:hint="eastAsia"/>
+              </w:rPr>
+              <w:t>7</w:t>
+            </w:r>
+            <w:r>
+              <w:rPr>
+                <w:rFonts w:ascii="Times New Roman" w:hAnsi="Times New Roman" w:cs="Times New Roman"/>
+              </w:rPr>
+              <w:t>-</w:t>
+            </w:r>
+            <w:r>
+              <w:rPr>
+                <w:rFonts w:ascii="Times New Roman" w:hAnsi="Times New Roman" w:cs="Times New Roman" w:hint="eastAsia"/>
+              </w:rPr>
+              <w:t>3-</w:t>
+            </w:r>
+            <w:r>
+              <w:rPr>
+                <w:rFonts w:ascii="Times New Roman" w:hAnsi="Times New Roman" w:cs="Times New Roman"/>
+              </w:rPr>
+              <w:t>202</w:t>
+            </w:r>
+            <w:r>
+              <w:rPr>
+                <w:rFonts w:ascii="Times New Roman" w:hAnsi="Times New Roman" w:cs="Times New Roman" w:hint="eastAsia"/>
+              </w:rPr>
+              <w:t>6</w:t>
+            </w:r>
+          </w:p>
+          <w:p>
+            <w:pPr>
+              <w:rPr>
+                <w:rFonts w:ascii="Times New Roman" w:hAnsi="Times New Roman" w:cs="Times New Roman"/>
+              </w:rPr>
+            </w:pPr>
+            <w:r>
+              <w:rPr>
+                <w:rFonts w:ascii="Times New Roman" w:hAnsi="Times New Roman" w:cs="Times New Roman"/>
+              </w:rPr>
+              <w:t>Supervision type: online meeting</w:t>
+            </w:r>
+          </w:p>
+          <w:p>
+            <w:pPr>
+              <w:rPr>
+                <w:rFonts w:ascii="Times New Roman" w:hAnsi="Times New Roman" w:cs="Times New Roman"/>
+              </w:rPr>
+            </w:pPr>
+            <w:r>
+              <w:rPr>
+                <w:rFonts w:ascii="Times New Roman" w:hAnsi="Times New Roman" w:cs="Times New Roman"/>
+              </w:rPr>
+              <w:t>Summary</w:t>
+            </w:r>
+            <w:r>
+              <w:rPr>
+                <w:rFonts w:ascii="Times New Roman" w:hAnsi="Times New Roman" w:cs="Times New Roman" w:hint="eastAsia"/>
+              </w:rPr>
+              <w:t>：</w:t>
+            </w:r>
+            <w:r>
+              <w:rPr>
+                <w:rFonts w:ascii="Times New Roman" w:hAnsi="Times New Roman" w:cs="Times New Roman"/>
+              </w:rPr>
+              <w:t>Discussed the oral presentation of the midterm report</w:t>
+            </w:r>
+          </w:p>
+          <w:p>
+            <w:pPr>
+              <w:rPr>
+                <w:rFonts w:ascii="Times New Roman" w:hAnsi="Times New Roman" w:cs="Times New Roman"/>
+              </w:rPr>
+            </w:pPr>
+          </w:p>
+          <w:p>
+            <w:pPr>
+              <w:rPr>
+                <w:rFonts w:ascii="Times New Roman" w:hAnsi="Times New Roman" w:cs="Times New Roman"/>
+              </w:rPr>
+            </w:pPr>
+          </w:p>
+          <w:p>
+            <w:pPr>
+              <w:rPr>
+                <w:rFonts w:ascii="Times New Roman" w:hAnsi="Times New Roman" w:cs="Times New Roman" w:hint="eastAsia"/>
+              </w:rPr>
+            </w:pPr>
+          </w:p>
+          <w:p>
+            <w:pPr>
+              <w:rPr>
+                <w:rFonts w:ascii="Times New Roman" w:hAnsi="Times New Roman" w:cs="Times New Roman"/>
+              </w:rPr>
+            </w:pPr>
+            <w:proofErr w:type="gramStart"/>
+            <w:r>
+              <w:rPr>
+                <w:rFonts w:ascii="Times New Roman" w:hAnsi="Times New Roman" w:cs="Times New Roman"/>
+              </w:rPr>
+              <w:t>Date:-</w:t>
+            </w:r>
+            <w:proofErr w:type="gramEnd"/>
+            <w:r>
+              <w:rPr>
+                <w:rFonts w:ascii="Times New Roman" w:hAnsi="Times New Roman" w:cs="Times New Roman" w:hint="eastAsia"/>
+              </w:rPr>
+              <w:t>11</w:t>
+            </w:r>
+            <w:r>
+              <w:rPr>
+                <w:rFonts w:ascii="Times New Roman" w:hAnsi="Times New Roman" w:cs="Times New Roman" w:hint="eastAsia"/>
+              </w:rPr>
+              <w:t>-</w:t>
+            </w:r>
+            <w:r>
+              <w:rPr>
+                <w:rFonts w:ascii="Times New Roman" w:hAnsi="Times New Roman" w:cs="Times New Roman" w:hint="eastAsia"/>
+              </w:rPr>
+              <w:t>3-</w:t>
+            </w:r>
+            <w:r>
+              <w:rPr>
+                <w:rFonts w:ascii="Times New Roman" w:hAnsi="Times New Roman" w:cs="Times New Roman"/>
+              </w:rPr>
+              <w:t>202</w:t>
+            </w:r>
+            <w:r>
+              <w:rPr>
+                <w:rFonts w:ascii="Times New Roman" w:hAnsi="Times New Roman" w:cs="Times New Roman" w:hint="eastAsia"/>
+              </w:rPr>
+              <w:t>6</w:t>
+            </w:r>
+          </w:p>
+          <w:p>
+            <w:pPr>
+              <w:rPr>
+                <w:rFonts w:ascii="Times New Roman" w:hAnsi="Times New Roman" w:cs="Times New Roman"/>
+              </w:rPr>
+            </w:pPr>
+            <w:r>
+              <w:rPr>
+                <w:rFonts w:ascii="Times New Roman" w:hAnsi="Times New Roman" w:cs="Times New Roman"/>
+              </w:rPr>
+              <w:t>Supervision type: online meeting</w:t>
+            </w:r>
+          </w:p>
+          <w:p>
+            <w:pPr>
+              <w:rPr>
+                <w:rFonts w:ascii="Times New Roman" w:hAnsi="Times New Roman" w:cs="Times New Roman"/>
+              </w:rPr>
+            </w:pPr>
+            <w:r>
+              <w:rPr>
+                <w:rFonts w:ascii="Times New Roman" w:hAnsi="Times New Roman" w:cs="Times New Roman"/>
+              </w:rPr>
+              <w:t>Summary</w:t>
+            </w:r>
+            <w:r>
+              <w:rPr>
+                <w:rFonts w:ascii="Times New Roman" w:hAnsi="Times New Roman" w:cs="Times New Roman" w:hint="eastAsia"/>
+              </w:rPr>
+              <w:t>：</w:t>
+            </w:r>
+            <w:r>
+              <w:rPr>
+                <w:rFonts w:ascii="Times New Roman" w:hAnsi="Times New Roman" w:cs="Times New Roman"/>
+              </w:rPr>
+              <w:t>Re read the early project specification report to ensure coverage of all committed goals, implement Python code to assess the impact of railway failures on the population (run it and add the results to Overleaf), and include other references on the robustness of the Overleaf railway system as key tasks for next week.</w:t>
+            </w:r>
           </w:p>
           <w:p>
             <w:pPr>
@@ -1936,7 +2604,6 @@
   <w:style w:type="character" w:default="1" w:styleId="a0">
     <w:name w:val="Default Paragraph Font"/>
     <w:uiPriority w:val="1"/>
-    <w:semiHidden/>
     <w:unhideWhenUsed/>
   </w:style>
   <w:style w:type="table" w:default="1" w:styleId="a1">
@@ -2302,6 +2969,19 @@
 </file>
 
 <file path=customXml/item1.xml><?xml version="1.0" encoding="utf-8"?>
+<?mso-contentType ?>
+<FormTemplates xmlns="http://schemas.microsoft.com/sharepoint/v3/contenttype/forms">
+  <Display>DocumentLibraryForm</Display>
+  <Edit>DocumentLibraryForm</Edit>
+  <New>DocumentLibraryForm</New>
+</FormTemplates>
+</file>
+
+<file path=customXml/item2.xml><?xml version="1.0" encoding="utf-8"?>
+<b:Sources xmlns:b="http://schemas.openxmlformats.org/officeDocument/2006/bibliography" xmlns="http://schemas.openxmlformats.org/officeDocument/2006/bibliography" SelectedStyle="\APASixthEditionOfficeOnline.xsl" StyleName="APA" Version="6"/>
+</file>
+
+<file path=customXml/item3.xml><?xml version="1.0" encoding="utf-8"?>
 <p:properties xmlns:p="http://schemas.microsoft.com/office/2006/metadata/properties" xmlns:xsi="http://www.w3.org/2001/XMLSchema-instance" xmlns:pc="http://schemas.microsoft.com/office/infopath/2007/PartnerControls">
   <documentManagement>
     <QMULInformationClassificationTaxHTField0 xmlns="http://schemas.microsoft.com/sharepoint/v3">
@@ -2355,19 +3035,6 @@
     <QMULProject xmlns="http://schemas.microsoft.com/sharepoint/v3" xsi:nil="true"/>
   </documentManagement>
 </p:properties>
-</file>
-
-<file path=customXml/item2.xml><?xml version="1.0" encoding="utf-8"?>
-<b:Sources xmlns:b="http://schemas.openxmlformats.org/officeDocument/2006/bibliography" xmlns="http://schemas.openxmlformats.org/officeDocument/2006/bibliography" SelectedStyle="\APASixthEditionOfficeOnline.xsl" StyleName="APA" Version="6"/>
-</file>
-
-<file path=customXml/item3.xml><?xml version="1.0" encoding="utf-8"?>
-<?mso-contentType ?>
-<FormTemplates xmlns="http://schemas.microsoft.com/sharepoint/v3/contenttype/forms">
-  <Display>DocumentLibraryForm</Display>
-  <Edit>DocumentLibraryForm</Edit>
-  <New>DocumentLibraryForm</New>
-</FormTemplates>
 </file>
 
 <file path=customXml/item4.xml><?xml version="1.0" encoding="utf-8"?>
@@ -2730,13 +3397,9 @@
 </file>
 
 <file path=customXml/itemProps1.xml><?xml version="1.0" encoding="utf-8"?>
-<ds:datastoreItem xmlns:ds="http://schemas.openxmlformats.org/officeDocument/2006/customXml" ds:itemID="{84D2A0A7-5CC5-4D94-BFEC-67D95788A223}">
+<ds:datastoreItem xmlns:ds="http://schemas.openxmlformats.org/officeDocument/2006/customXml" ds:itemID="{F12EF910-F447-49BA-A000-4FC81D3C5AC2}">
   <ds:schemaRefs>
-    <ds:schemaRef ds:uri="http://schemas.microsoft.com/office/2006/metadata/properties"/>
-    <ds:schemaRef ds:uri="http://schemas.microsoft.com/office/infopath/2007/PartnerControls"/>
-    <ds:schemaRef ds:uri="http://schemas.microsoft.com/sharepoint/v3"/>
-    <ds:schemaRef ds:uri="ad1b7021-3cc8-42a8-966a-1a70eaf3b65a"/>
-    <ds:schemaRef ds:uri="ac047116-60af-4843-8a0c-1daee2e3446c"/>
+    <ds:schemaRef ds:uri="http://schemas.microsoft.com/sharepoint/v3/contenttype/forms"/>
   </ds:schemaRefs>
 </ds:datastoreItem>
 </file>
@@ -2750,9 +3413,13 @@
 </file>
 
 <file path=customXml/itemProps3.xml><?xml version="1.0" encoding="utf-8"?>
-<ds:datastoreItem xmlns:ds="http://schemas.openxmlformats.org/officeDocument/2006/customXml" ds:itemID="{F12EF910-F447-49BA-A000-4FC81D3C5AC2}">
+<ds:datastoreItem xmlns:ds="http://schemas.openxmlformats.org/officeDocument/2006/customXml" ds:itemID="{84D2A0A7-5CC5-4D94-BFEC-67D95788A223}">
   <ds:schemaRefs>
-    <ds:schemaRef ds:uri="http://schemas.microsoft.com/sharepoint/v3/contenttype/forms"/>
+    <ds:schemaRef ds:uri="http://schemas.microsoft.com/office/2006/metadata/properties"/>
+    <ds:schemaRef ds:uri="http://schemas.microsoft.com/office/infopath/2007/PartnerControls"/>
+    <ds:schemaRef ds:uri="http://schemas.microsoft.com/sharepoint/v3"/>
+    <ds:schemaRef ds:uri="ad1b7021-3cc8-42a8-966a-1a70eaf3b65a"/>
+    <ds:schemaRef ds:uri="ac047116-60af-4843-8a0c-1daee2e3446c"/>
   </ds:schemaRefs>
 </ds:datastoreItem>
 </file>

</xml_diff>